<commit_message>
Tighten the capstone report against the V8 review
Five embeddings (not six), qualify Mode-3A pad vs squawk 0000,
label ensemble as a single-run +0.007 MOTA, disclose Sweden tiling
and max_age=10 vs CLI max_age=2, add Table 10 ablations, drop the
duplicate AIML docx, and mark design_v8 as trained.
</commit_message>
<xml_diff>
--- a/artifacts/Capstone_Progress_Report.docx
+++ b/artifacts/Capstone_Progress_Report.docx
@@ -278,7 +278,7 @@
           <w:sz w:val="22"/>
           <w:szCs w:val="22"/>
         </w:rPr>
-        <w:t xml:space="preserve">The working system is Hybrid: a clutter MLP, two pairwise association MLPs, Hungarian assignment, and an asynchronous Kalman filter. On the dense 120-second multi-radar stream it holds MOTA 0.865 with zero ID switches. On a 30-minute Sweden holdout it reaches MOTA 0.971. End-to-end learned trackers (GNN V3–V6 and the V7 transformer) did not. They flooded the picture with false tracks.</w:t>
+        <w:t xml:space="preserve">The working system is Hybrid: a clutter MLP, two pairwise association MLPs, Hungarian assignment, and an asynchronous Kalman filter. On the dense 120-second multi-radar stream, under the max_age = 10 eval contract in §6.1, it holds MOTA 0.865 with zero ID switches. On a 30-minute Sweden holdout it reaches MOTA 0.971. End-to-end learned trackers (GNN V3–V6 and the V7 transformer) did not. They flooded the picture with false tracks.</w:t>
       </w:r>
     </w:p>
     <w:p>
@@ -297,7 +297,7 @@
           <w:sz w:val="22"/>
           <w:szCs w:val="22"/>
         </w:rPr>
-        <w:t xml:space="preserve">V8 is the course correction. It is not a new tracker. It is a transformer that scores gated pairs inside Hybrid — looking at the surrounding traffic, not just one pair in isolation. Pure V8 is not ready to ship. Averaging it with the MLP (ensemble) slightly beats Hybrid on the dense sim stream (MOTA 0.872 vs 0.865) and ties Hybrid on Sweden. That is the research result, not the operational default.</w:t>
+        <w:t xml:space="preserve">V8 is the course correction. It is not a new tracker. It is a transformer that scores gated pairs inside Hybrid — looking at the surrounding traffic, not just one pair in isolation. Pure V8 is not ready to ship. Averaging it with the MLP (ensemble) is a single-run +0.007 MOTA on the dense sim stream (0.872 vs 0.865) with zero ID switches, and it ties Hybrid on Sweden. That is a hint, not a claim that the transformer beats Hybrid, and not the operational default.</w:t>
       </w:r>
     </w:p>
     <w:p>
@@ -753,7 +753,7 @@
       <w:r>
         <w:drawing>
           <wp:inline distT="0" distB="0" distL="0" distR="0">
-            <wp:extent cx="5905500" cy="3933825"/>
+            <wp:extent cx="5905500" cy="3324225"/>
             <wp:effectExtent t="0" r="0" b="0" l="0"/>
             <wp:docPr id="1" name="Hybrid tracker simulation with confirmed tracks and trails" descr="Hybrid tracker simulation with confirmed tracks and trails" title="Hybrid tracker simulation with confirmed tracks and trails"/>
             <wp:cNvGraphicFramePr>
@@ -778,7 +778,7 @@
                   <pic:spPr bwMode="auto">
                     <a:xfrm>
                       <a:off x="0" y="0"/>
-                      <a:ext cx="5905500" cy="3933825"/>
+                      <a:ext cx="5905500" cy="3324225"/>
                     </a:xfrm>
                     <a:prstGeom prst="rect">
                       <a:avLst/>
@@ -3639,7 +3639,7 @@
           <w:sz w:val="22"/>
           <w:szCs w:val="22"/>
         </w:rPr>
-        <w:t xml:space="preserve">Raw meters are never fed in. Numeric features are normalized, then projected Linear(15 → 64). Six embeddings, each 64-d, are added: role (track vs measurement), type (PSR vs SSR), sensor id (0–8), Mode-3A (0–4095, pad 0 = missing), and hashed Mode-S (1024 buckets, 0 = missing). Missing identity is a dedicated pad index, never squawk 0000.</w:t>
+        <w:t xml:space="preserve">Raw meters are never fed in. Numeric features are normalized, then projected Linear(15 → 64). Five embeddings, each 64-d, are added: role (track vs measurement), type (PSR vs SSR), sensor id (0–8), Mode-3A (0–4095), and hashed Mode-S (1024 buckets). Missing identity uses pad index 0. Present squawk 0000 collides with that pad; the numeric has_mode_3a flag is the disambiguator, not a separate unused pad token.</w:t>
       </w:r>
     </w:p>
     <w:tbl>
@@ -6042,7 +6042,7 @@
           <w:sz w:val="22"/>
           <w:szCs w:val="22"/>
         </w:rPr>
-        <w:t xml:space="preserve">The same two aircraft cross. After self-attention, track A’s token has mixed with track C’s token: both are live, close, and claiming plots. Plot B’s token has mixed with the other plots in the gate, including the one that actually carries C’s Mode-S. The score head then sees [h_A ; h_B ; rel_AB]. rel_AB still says “close.” h_A and h_B can now say “but C is a better owner.” The MLP cannot produce that sentence. That is the only reason to keep a transformer in a system whose Kalman filter already wins MOTA.</w:t>
+        <w:t xml:space="preserve">The same two aircraft cross. After self-attention, track A’s token has mixed with track C’s token: both are live, close, and claiming plots. Plot B’s token has mixed with the other plots in the gate, including the one that actually carries C’s Mode-S. The score head then sees [h_A ; h_B ; rel_AB]. rel_AB still says “close.” The intended mechanism is that h_A and h_B can now carry “C is a better owner.” We have not shown an attention map or a crossing slice where V8 flips a pair the MLP got wrong. Until that overlap holdout exists, it is a hypothesis with a single-run +0.007 MOTA hint, not a demonstrated capability.</w:t>
       </w:r>
     </w:p>
     <w:p>
@@ -7495,7 +7495,7 @@
           <w:sz w:val="22"/>
           <w:szCs w:val="22"/>
         </w:rPr>
-        <w:t xml:space="preserve">Ensemble is not a third network. At each gated pair Hybrid computes p = 0.5 p_MLP + 0.5 p_V8, then uses that p exactly as it would use a single scorer. The MLP vetoes reckless transformer edges; the transformer still nudges pairs the MLP cannot see in context. On the dense stream that mix is MOTA 0.872 versus Hybrid 0.865, with zero ID switches. On Sweden it ties Hybrid. Dustbin is off on this path.</w:t>
+        <w:t xml:space="preserve">Ensemble is not a third network. At each gated pair Hybrid computes p = 0.5 p_MLP + 0.5 p_V8, then uses that p exactly as it would use a single scorer. The MLP vetoes reckless transformer edges; the transformer still nudges pairs the MLP cannot see in context. On the dense stream that mix is a single-run +0.007 MOTA (0.872 vs 0.865) with zero ID switches. On Sweden the three reported decimals are identical to Hybrid — consistent with V8 not changing those decisions. Dustbin is off on this path.</w:t>
       </w:r>
     </w:p>
     <w:p>
@@ -9040,7 +9040,7 @@
                 <w:sz w:val="18"/>
                 <w:szCs w:val="18"/>
               </w:rPr>
-              <w:t xml:space="preserve">Recall up, precision down</w:t>
+              <w:t xml:space="preserve">Dense stream: recall up, precision down</w:t>
             </w:r>
           </w:p>
         </w:tc>
@@ -9190,7 +9190,7 @@
                 <w:sz w:val="18"/>
                 <w:szCs w:val="18"/>
               </w:rPr>
-              <w:t xml:space="preserve">Slight MOTA win on dense sim</w:t>
+              <w:t xml:space="preserve">Single-run +0.007 MOTA on dense sim</w:t>
             </w:r>
           </w:p>
         </w:tc>
@@ -9272,7 +9272,7 @@
           <w:sz w:val="22"/>
           <w:szCs w:val="22"/>
         </w:rPr>
-        <w:t xml:space="preserve">Unless noted, numbers below use the same contract: 1-second evaluation windows, min_hits = 3, max_age = 10, match threshold 7 km. The dense stream is data/stream_radar_001.jsonl (~126 s, five asynchronous radars, 246 truth IDs). The real-traffic holdout is data/canonical/stream_sweden_30min_holdout.jsonl (~30 min, 163 IDs, built from CAT-062 traffic through a multi-radar observation model). V6/V7 rows on the dense stream are from the earlier streaming campaign on that same file.</w:t>
+        <w:t xml:space="preserve">Unless noted, numbers below use the same contract: 1-second evaluation windows, min_hits = 3, max_age = 10, match threshold 7 km. The CLI default is max_age = 2; that shorter coast produces a different Hybrid MOTA (about 0.58 on this file) and is not the table below. The dense stream is data/stream_radar_001.jsonl (~126 s, five asynchronous radars, 246 truth IDs). The real-traffic holdout is data/canonical/stream_sweden_30min_holdout.jsonl (~30 min, 163 IDs). It is CAT-062 traffic passed through a multi-radar observation model, then packed as a 6-tile / 3×-mini stream — duration is real, geometry is repeated, not 30 independent minutes of new crossings. V6/V7 rows on the dense stream are from the earlier streaming campaign on that same file.</w:t>
       </w:r>
     </w:p>
     <w:p>
@@ -10902,7 +10902,7 @@
           <w:sz w:val="18"/>
           <w:szCs w:val="18"/>
         </w:rPr>
-        <w:t xml:space="preserve">Table 8. stream_radar_001. Hybrid is the first system that is actually a tracker. Ensemble is a small, honest gain on top of it.</w:t>
+        <w:t xml:space="preserve">Table 8. stream_radar_001, max_age = 10. Hybrid is the first system that is actually a tracker. Ensemble is a single-run +0.007 MOTA on top of it, not a statistically tested win.</w:t>
       </w:r>
     </w:p>
     <w:p>
@@ -11860,7 +11860,26 @@
           <w:sz w:val="18"/>
           <w:szCs w:val="18"/>
         </w:rPr>
-        <w:t xml:space="preserve">Table 9. Sweden holdout. Hybrid is already near the ceiling. Ensemble ties it. Pure V8 again loses precision.</w:t>
+        <w:t xml:space="preserve">Table 9. Sweden holdout (tiled CAT-062 observation-model stream). Hybrid is already near the ceiling. Ensemble matches it to three decimals — V8 is not changing those decisions. Pure V8 again loses precision.</w:t>
+      </w:r>
+    </w:p>
+    <w:p>
+      <w:pPr>
+        <w:spacing w:after="160" w:before="0" w:line="276"/>
+        <w:jc w:val="both"/>
+      </w:pPr>
+      <w:r>
+        <w:rPr>
+          <w:rFonts w:ascii="Arial" w:cs="Arial" w:eastAsia="Arial" w:hAnsi="Arial"/>
+          <w:b w:val="false"/>
+          <w:bCs w:val="false"/>
+          <w:i w:val="false"/>
+          <w:iCs w:val="false"/>
+          <w:color w:val="222222"/>
+          <w:sz w:val="22"/>
+          <w:szCs w:val="22"/>
+        </w:rPr>
+        <w:t xml:space="preserve">The holdout is the second half of a 6-tile pack of Sweden CAT-062 traffic, regenerated through the multi-radar observation model (see data/canonical/DATA_MANIFEST.md). Median nearest-neighbor distance is about 32 km and concurrent traffic tops out around 32 aircraft, so pairs inside the 2 km / 8 km gates are uncommon. Tiling stretches duration without adding new geometry. Treat Table 9 as a long easy-geometry run, not as a crossing study.</w:t>
       </w:r>
     </w:p>
     <w:p>
@@ -11944,7 +11963,1003 @@
           <w:sz w:val="26"/>
           <w:szCs w:val="26"/>
         </w:rPr>
-        <w:t xml:space="preserve">6.4  How to read this</w:t>
+        <w:t xml:space="preserve">6.4  Ablations on the dense stream</w:t>
+      </w:r>
+    </w:p>
+    <w:tbl>
+      <w:tblPr>
+        <w:tblW w:type="dxa" w:w="10080"/>
+        <w:tblBorders>
+          <w:top w:val="single" w:color="auto" w:sz="4"/>
+          <w:left w:val="single" w:color="auto" w:sz="4"/>
+          <w:bottom w:val="single" w:color="auto" w:sz="4"/>
+          <w:right w:val="single" w:color="auto" w:sz="4"/>
+          <w:insideH w:val="single" w:color="auto" w:sz="4"/>
+          <w:insideV w:val="single" w:color="auto" w:sz="4"/>
+        </w:tblBorders>
+      </w:tblPr>
+      <w:tblGrid>
+        <w:gridCol w:w="3600"/>
+        <w:gridCol w:w="1600"/>
+        <w:gridCol w:w="1600"/>
+        <w:gridCol w:w="1640"/>
+        <w:gridCol w:w="1640"/>
+      </w:tblGrid>
+      <w:tr>
+        <w:trPr>
+          <w:tblHeader/>
+        </w:trPr>
+        <w:tc>
+          <w:tcPr>
+            <w:tcW w:type="dxa" w:w="3600"/>
+            <w:tcBorders>
+              <w:top w:val="single" w:color="B0BEC5" w:sz="4"/>
+              <w:left w:val="single" w:color="B0BEC5" w:sz="4"/>
+              <w:bottom w:val="single" w:color="B0BEC5" w:sz="4"/>
+              <w:right w:val="single" w:color="B0BEC5" w:sz="4"/>
+            </w:tcBorders>
+            <w:shd w:fill="0B3D5C" w:val="clear"/>
+            <w:tcMar>
+              <w:top w:type="dxa" w:w="50"/>
+              <w:left w:type="dxa" w:w="70"/>
+              <w:bottom w:type="dxa" w:w="50"/>
+              <w:right w:type="dxa" w:w="70"/>
+            </w:tcMar>
+            <w:vAlign w:val="center"/>
+          </w:tcPr>
+          <w:p>
+            <w:pPr>
+              <w:jc w:val="center"/>
+            </w:pPr>
+            <w:r>
+              <w:rPr>
+                <w:rFonts w:ascii="Arial" w:cs="Arial" w:eastAsia="Arial" w:hAnsi="Arial"/>
+                <w:b/>
+                <w:bCs/>
+                <w:i w:val="false"/>
+                <w:iCs w:val="false"/>
+                <w:color w:val="FFFFFF"/>
+                <w:sz w:val="18"/>
+                <w:szCs w:val="18"/>
+              </w:rPr>
+              <w:t xml:space="preserve">Variant</w:t>
+            </w:r>
+          </w:p>
+        </w:tc>
+        <w:tc>
+          <w:tcPr>
+            <w:tcW w:type="dxa" w:w="1600"/>
+            <w:tcBorders>
+              <w:top w:val="single" w:color="B0BEC5" w:sz="4"/>
+              <w:left w:val="single" w:color="B0BEC5" w:sz="4"/>
+              <w:bottom w:val="single" w:color="B0BEC5" w:sz="4"/>
+              <w:right w:val="single" w:color="B0BEC5" w:sz="4"/>
+            </w:tcBorders>
+            <w:shd w:fill="0B3D5C" w:val="clear"/>
+            <w:tcMar>
+              <w:top w:type="dxa" w:w="50"/>
+              <w:left w:type="dxa" w:w="70"/>
+              <w:bottom w:type="dxa" w:w="50"/>
+              <w:right w:type="dxa" w:w="70"/>
+            </w:tcMar>
+            <w:vAlign w:val="center"/>
+          </w:tcPr>
+          <w:p>
+            <w:pPr>
+              <w:jc w:val="center"/>
+            </w:pPr>
+            <w:r>
+              <w:rPr>
+                <w:rFonts w:ascii="Arial" w:cs="Arial" w:eastAsia="Arial" w:hAnsi="Arial"/>
+                <w:b/>
+                <w:bCs/>
+                <w:i w:val="false"/>
+                <w:iCs w:val="false"/>
+                <w:color w:val="FFFFFF"/>
+                <w:sz w:val="18"/>
+                <w:szCs w:val="18"/>
+              </w:rPr>
+              <w:t xml:space="preserve">MOTA</w:t>
+            </w:r>
+          </w:p>
+        </w:tc>
+        <w:tc>
+          <w:tcPr>
+            <w:tcW w:type="dxa" w:w="1600"/>
+            <w:tcBorders>
+              <w:top w:val="single" w:color="B0BEC5" w:sz="4"/>
+              <w:left w:val="single" w:color="B0BEC5" w:sz="4"/>
+              <w:bottom w:val="single" w:color="B0BEC5" w:sz="4"/>
+              <w:right w:val="single" w:color="B0BEC5" w:sz="4"/>
+            </w:tcBorders>
+            <w:shd w:fill="0B3D5C" w:val="clear"/>
+            <w:tcMar>
+              <w:top w:type="dxa" w:w="50"/>
+              <w:left w:type="dxa" w:w="70"/>
+              <w:bottom w:type="dxa" w:w="50"/>
+              <w:right w:type="dxa" w:w="70"/>
+            </w:tcMar>
+            <w:vAlign w:val="center"/>
+          </w:tcPr>
+          <w:p>
+            <w:pPr>
+              <w:jc w:val="center"/>
+            </w:pPr>
+            <w:r>
+              <w:rPr>
+                <w:rFonts w:ascii="Arial" w:cs="Arial" w:eastAsia="Arial" w:hAnsi="Arial"/>
+                <w:b/>
+                <w:bCs/>
+                <w:i w:val="false"/>
+                <w:iCs w:val="false"/>
+                <w:color w:val="FFFFFF"/>
+                <w:sz w:val="18"/>
+                <w:szCs w:val="18"/>
+              </w:rPr>
+              <w:t xml:space="preserve">Prec.</w:t>
+            </w:r>
+          </w:p>
+        </w:tc>
+        <w:tc>
+          <w:tcPr>
+            <w:tcW w:type="dxa" w:w="1640"/>
+            <w:tcBorders>
+              <w:top w:val="single" w:color="B0BEC5" w:sz="4"/>
+              <w:left w:val="single" w:color="B0BEC5" w:sz="4"/>
+              <w:bottom w:val="single" w:color="B0BEC5" w:sz="4"/>
+              <w:right w:val="single" w:color="B0BEC5" w:sz="4"/>
+            </w:tcBorders>
+            <w:shd w:fill="0B3D5C" w:val="clear"/>
+            <w:tcMar>
+              <w:top w:type="dxa" w:w="50"/>
+              <w:left w:type="dxa" w:w="70"/>
+              <w:bottom w:type="dxa" w:w="50"/>
+              <w:right w:type="dxa" w:w="70"/>
+            </w:tcMar>
+            <w:vAlign w:val="center"/>
+          </w:tcPr>
+          <w:p>
+            <w:pPr>
+              <w:jc w:val="center"/>
+            </w:pPr>
+            <w:r>
+              <w:rPr>
+                <w:rFonts w:ascii="Arial" w:cs="Arial" w:eastAsia="Arial" w:hAnsi="Arial"/>
+                <w:b/>
+                <w:bCs/>
+                <w:i w:val="false"/>
+                <w:iCs w:val="false"/>
+                <w:color w:val="FFFFFF"/>
+                <w:sz w:val="18"/>
+                <w:szCs w:val="18"/>
+              </w:rPr>
+              <w:t xml:space="preserve">Recall</w:t>
+            </w:r>
+          </w:p>
+        </w:tc>
+        <w:tc>
+          <w:tcPr>
+            <w:tcW w:type="dxa" w:w="1640"/>
+            <w:tcBorders>
+              <w:top w:val="single" w:color="B0BEC5" w:sz="4"/>
+              <w:left w:val="single" w:color="B0BEC5" w:sz="4"/>
+              <w:bottom w:val="single" w:color="B0BEC5" w:sz="4"/>
+              <w:right w:val="single" w:color="B0BEC5" w:sz="4"/>
+            </w:tcBorders>
+            <w:shd w:fill="0B3D5C" w:val="clear"/>
+            <w:tcMar>
+              <w:top w:type="dxa" w:w="50"/>
+              <w:left w:type="dxa" w:w="70"/>
+              <w:bottom w:type="dxa" w:w="50"/>
+              <w:right w:type="dxa" w:w="70"/>
+            </w:tcMar>
+            <w:vAlign w:val="center"/>
+          </w:tcPr>
+          <w:p>
+            <w:pPr>
+              <w:jc w:val="center"/>
+            </w:pPr>
+            <w:r>
+              <w:rPr>
+                <w:rFonts w:ascii="Arial" w:cs="Arial" w:eastAsia="Arial" w:hAnsi="Arial"/>
+                <w:b/>
+                <w:bCs/>
+                <w:i w:val="false"/>
+                <w:iCs w:val="false"/>
+                <w:color w:val="FFFFFF"/>
+                <w:sz w:val="18"/>
+                <w:szCs w:val="18"/>
+              </w:rPr>
+              <w:t xml:space="preserve">IDs</w:t>
+            </w:r>
+          </w:p>
+        </w:tc>
+      </w:tr>
+      <w:tr>
+        <w:tc>
+          <w:tcPr>
+            <w:tcW w:type="dxa" w:w="3600"/>
+            <w:tcBorders>
+              <w:top w:val="single" w:color="B0BEC5" w:sz="4"/>
+              <w:left w:val="single" w:color="B0BEC5" w:sz="4"/>
+              <w:bottom w:val="single" w:color="B0BEC5" w:sz="4"/>
+              <w:right w:val="single" w:color="B0BEC5" w:sz="4"/>
+            </w:tcBorders>
+            <w:shd w:fill="FFFFFF" w:val="clear"/>
+            <w:tcMar>
+              <w:top w:type="dxa" w:w="50"/>
+              <w:left w:type="dxa" w:w="70"/>
+              <w:bottom w:type="dxa" w:w="50"/>
+              <w:right w:type="dxa" w:w="70"/>
+            </w:tcMar>
+            <w:vAlign w:val="center"/>
+          </w:tcPr>
+          <w:p>
+            <w:pPr>
+              <w:jc w:val="left"/>
+            </w:pPr>
+            <w:r>
+              <w:rPr>
+                <w:rFonts w:ascii="Arial" w:cs="Arial" w:eastAsia="Arial" w:hAnsi="Arial"/>
+                <w:b w:val="false"/>
+                <w:bCs w:val="false"/>
+                <w:i w:val="false"/>
+                <w:iCs w:val="false"/>
+                <w:color w:val="222222"/>
+                <w:sz w:val="18"/>
+                <w:szCs w:val="18"/>
+              </w:rPr>
+              <w:t xml:space="preserve">V8 only (cluster + assign)</w:t>
+            </w:r>
+          </w:p>
+        </w:tc>
+        <w:tc>
+          <w:tcPr>
+            <w:tcW w:type="dxa" w:w="1600"/>
+            <w:tcBorders>
+              <w:top w:val="single" w:color="B0BEC5" w:sz="4"/>
+              <w:left w:val="single" w:color="B0BEC5" w:sz="4"/>
+              <w:bottom w:val="single" w:color="B0BEC5" w:sz="4"/>
+              <w:right w:val="single" w:color="B0BEC5" w:sz="4"/>
+            </w:tcBorders>
+            <w:shd w:fill="FFFFFF" w:val="clear"/>
+            <w:tcMar>
+              <w:top w:type="dxa" w:w="50"/>
+              <w:left w:type="dxa" w:w="70"/>
+              <w:bottom w:type="dxa" w:w="50"/>
+              <w:right w:type="dxa" w:w="70"/>
+            </w:tcMar>
+            <w:vAlign w:val="center"/>
+          </w:tcPr>
+          <w:p>
+            <w:pPr>
+              <w:jc w:val="center"/>
+            </w:pPr>
+            <w:r>
+              <w:rPr>
+                <w:rFonts w:ascii="Arial" w:cs="Arial" w:eastAsia="Arial" w:hAnsi="Arial"/>
+                <w:b w:val="false"/>
+                <w:bCs w:val="false"/>
+                <w:i w:val="false"/>
+                <w:iCs w:val="false"/>
+                <w:color w:val="222222"/>
+                <w:sz w:val="18"/>
+                <w:szCs w:val="18"/>
+              </w:rPr>
+              <w:t xml:space="preserve">0.526</w:t>
+            </w:r>
+          </w:p>
+        </w:tc>
+        <w:tc>
+          <w:tcPr>
+            <w:tcW w:type="dxa" w:w="1600"/>
+            <w:tcBorders>
+              <w:top w:val="single" w:color="B0BEC5" w:sz="4"/>
+              <w:left w:val="single" w:color="B0BEC5" w:sz="4"/>
+              <w:bottom w:val="single" w:color="B0BEC5" w:sz="4"/>
+              <w:right w:val="single" w:color="B0BEC5" w:sz="4"/>
+            </w:tcBorders>
+            <w:shd w:fill="FFFFFF" w:val="clear"/>
+            <w:tcMar>
+              <w:top w:type="dxa" w:w="50"/>
+              <w:left w:type="dxa" w:w="70"/>
+              <w:bottom w:type="dxa" w:w="50"/>
+              <w:right w:type="dxa" w:w="70"/>
+            </w:tcMar>
+            <w:vAlign w:val="center"/>
+          </w:tcPr>
+          <w:p>
+            <w:pPr>
+              <w:jc w:val="center"/>
+            </w:pPr>
+            <w:r>
+              <w:rPr>
+                <w:rFonts w:ascii="Arial" w:cs="Arial" w:eastAsia="Arial" w:hAnsi="Arial"/>
+                <w:b w:val="false"/>
+                <w:bCs w:val="false"/>
+                <w:i w:val="false"/>
+                <w:iCs w:val="false"/>
+                <w:color w:val="222222"/>
+                <w:sz w:val="18"/>
+                <w:szCs w:val="18"/>
+              </w:rPr>
+              <w:t xml:space="preserve">0.692</w:t>
+            </w:r>
+          </w:p>
+        </w:tc>
+        <w:tc>
+          <w:tcPr>
+            <w:tcW w:type="dxa" w:w="1640"/>
+            <w:tcBorders>
+              <w:top w:val="single" w:color="B0BEC5" w:sz="4"/>
+              <w:left w:val="single" w:color="B0BEC5" w:sz="4"/>
+              <w:bottom w:val="single" w:color="B0BEC5" w:sz="4"/>
+              <w:right w:val="single" w:color="B0BEC5" w:sz="4"/>
+            </w:tcBorders>
+            <w:shd w:fill="FFFFFF" w:val="clear"/>
+            <w:tcMar>
+              <w:top w:type="dxa" w:w="50"/>
+              <w:left w:type="dxa" w:w="70"/>
+              <w:bottom w:type="dxa" w:w="50"/>
+              <w:right w:type="dxa" w:w="70"/>
+            </w:tcMar>
+            <w:vAlign w:val="center"/>
+          </w:tcPr>
+          <w:p>
+            <w:pPr>
+              <w:jc w:val="center"/>
+            </w:pPr>
+            <w:r>
+              <w:rPr>
+                <w:rFonts w:ascii="Arial" w:cs="Arial" w:eastAsia="Arial" w:hAnsi="Arial"/>
+                <w:b w:val="false"/>
+                <w:bCs w:val="false"/>
+                <w:i w:val="false"/>
+                <w:iCs w:val="false"/>
+                <w:color w:val="222222"/>
+                <w:sz w:val="18"/>
+                <w:szCs w:val="18"/>
+              </w:rPr>
+              <w:t xml:space="preserve">0.946</w:t>
+            </w:r>
+          </w:p>
+        </w:tc>
+        <w:tc>
+          <w:tcPr>
+            <w:tcW w:type="dxa" w:w="1640"/>
+            <w:tcBorders>
+              <w:top w:val="single" w:color="B0BEC5" w:sz="4"/>
+              <w:left w:val="single" w:color="B0BEC5" w:sz="4"/>
+              <w:bottom w:val="single" w:color="B0BEC5" w:sz="4"/>
+              <w:right w:val="single" w:color="B0BEC5" w:sz="4"/>
+            </w:tcBorders>
+            <w:shd w:fill="FFFFFF" w:val="clear"/>
+            <w:tcMar>
+              <w:top w:type="dxa" w:w="50"/>
+              <w:left w:type="dxa" w:w="70"/>
+              <w:bottom w:type="dxa" w:w="50"/>
+              <w:right w:type="dxa" w:w="70"/>
+            </w:tcMar>
+            <w:vAlign w:val="center"/>
+          </w:tcPr>
+          <w:p>
+            <w:pPr>
+              <w:jc w:val="center"/>
+            </w:pPr>
+            <w:r>
+              <w:rPr>
+                <w:rFonts w:ascii="Arial" w:cs="Arial" w:eastAsia="Arial" w:hAnsi="Arial"/>
+                <w:b w:val="false"/>
+                <w:bCs w:val="false"/>
+                <w:i w:val="false"/>
+                <w:iCs w:val="false"/>
+                <w:color w:val="222222"/>
+                <w:sz w:val="18"/>
+                <w:szCs w:val="18"/>
+              </w:rPr>
+              <w:t xml:space="preserve">0</w:t>
+            </w:r>
+          </w:p>
+        </w:tc>
+      </w:tr>
+      <w:tr>
+        <w:tc>
+          <w:tcPr>
+            <w:tcW w:type="dxa" w:w="3600"/>
+            <w:tcBorders>
+              <w:top w:val="single" w:color="B0BEC5" w:sz="4"/>
+              <w:left w:val="single" w:color="B0BEC5" w:sz="4"/>
+              <w:bottom w:val="single" w:color="B0BEC5" w:sz="4"/>
+              <w:right w:val="single" w:color="B0BEC5" w:sz="4"/>
+            </w:tcBorders>
+            <w:shd w:fill="E8EEF4" w:val="clear"/>
+            <w:tcMar>
+              <w:top w:type="dxa" w:w="50"/>
+              <w:left w:type="dxa" w:w="70"/>
+              <w:bottom w:type="dxa" w:w="50"/>
+              <w:right w:type="dxa" w:w="70"/>
+            </w:tcMar>
+            <w:vAlign w:val="center"/>
+          </w:tcPr>
+          <w:p>
+            <w:pPr>
+              <w:jc w:val="left"/>
+            </w:pPr>
+            <w:r>
+              <w:rPr>
+                <w:rFonts w:ascii="Arial" w:cs="Arial" w:eastAsia="Arial" w:hAnsi="Arial"/>
+                <w:b w:val="false"/>
+                <w:bCs w:val="false"/>
+                <w:i w:val="false"/>
+                <w:iCs w:val="false"/>
+                <w:color w:val="222222"/>
+                <w:sz w:val="18"/>
+                <w:szCs w:val="18"/>
+              </w:rPr>
+              <w:t xml:space="preserve">MLP cluster + V8 assign (split)</w:t>
+            </w:r>
+          </w:p>
+        </w:tc>
+        <w:tc>
+          <w:tcPr>
+            <w:tcW w:type="dxa" w:w="1600"/>
+            <w:tcBorders>
+              <w:top w:val="single" w:color="B0BEC5" w:sz="4"/>
+              <w:left w:val="single" w:color="B0BEC5" w:sz="4"/>
+              <w:bottom w:val="single" w:color="B0BEC5" w:sz="4"/>
+              <w:right w:val="single" w:color="B0BEC5" w:sz="4"/>
+            </w:tcBorders>
+            <w:shd w:fill="E8EEF4" w:val="clear"/>
+            <w:tcMar>
+              <w:top w:type="dxa" w:w="50"/>
+              <w:left w:type="dxa" w:w="70"/>
+              <w:bottom w:type="dxa" w:w="50"/>
+              <w:right w:type="dxa" w:w="70"/>
+            </w:tcMar>
+            <w:vAlign w:val="center"/>
+          </w:tcPr>
+          <w:p>
+            <w:pPr>
+              <w:jc w:val="center"/>
+            </w:pPr>
+            <w:r>
+              <w:rPr>
+                <w:rFonts w:ascii="Arial" w:cs="Arial" w:eastAsia="Arial" w:hAnsi="Arial"/>
+                <w:b w:val="false"/>
+                <w:bCs w:val="false"/>
+                <w:i w:val="false"/>
+                <w:iCs w:val="false"/>
+                <w:color w:val="222222"/>
+                <w:sz w:val="18"/>
+                <w:szCs w:val="18"/>
+              </w:rPr>
+              <w:t xml:space="preserve">0.845</w:t>
+            </w:r>
+          </w:p>
+        </w:tc>
+        <w:tc>
+          <w:tcPr>
+            <w:tcW w:type="dxa" w:w="1600"/>
+            <w:tcBorders>
+              <w:top w:val="single" w:color="B0BEC5" w:sz="4"/>
+              <w:left w:val="single" w:color="B0BEC5" w:sz="4"/>
+              <w:bottom w:val="single" w:color="B0BEC5" w:sz="4"/>
+              <w:right w:val="single" w:color="B0BEC5" w:sz="4"/>
+            </w:tcBorders>
+            <w:shd w:fill="E8EEF4" w:val="clear"/>
+            <w:tcMar>
+              <w:top w:type="dxa" w:w="50"/>
+              <w:left w:type="dxa" w:w="70"/>
+              <w:bottom w:type="dxa" w:w="50"/>
+              <w:right w:type="dxa" w:w="70"/>
+            </w:tcMar>
+            <w:vAlign w:val="center"/>
+          </w:tcPr>
+          <w:p>
+            <w:pPr>
+              <w:jc w:val="center"/>
+            </w:pPr>
+            <w:r>
+              <w:rPr>
+                <w:rFonts w:ascii="Arial" w:cs="Arial" w:eastAsia="Arial" w:hAnsi="Arial"/>
+                <w:b w:val="false"/>
+                <w:bCs w:val="false"/>
+                <w:i w:val="false"/>
+                <w:iCs w:val="false"/>
+                <w:color w:val="222222"/>
+                <w:sz w:val="18"/>
+                <w:szCs w:val="18"/>
+              </w:rPr>
+              <w:t xml:space="preserve">0.916</w:t>
+            </w:r>
+          </w:p>
+        </w:tc>
+        <w:tc>
+          <w:tcPr>
+            <w:tcW w:type="dxa" w:w="1640"/>
+            <w:tcBorders>
+              <w:top w:val="single" w:color="B0BEC5" w:sz="4"/>
+              <w:left w:val="single" w:color="B0BEC5" w:sz="4"/>
+              <w:bottom w:val="single" w:color="B0BEC5" w:sz="4"/>
+              <w:right w:val="single" w:color="B0BEC5" w:sz="4"/>
+            </w:tcBorders>
+            <w:shd w:fill="E8EEF4" w:val="clear"/>
+            <w:tcMar>
+              <w:top w:type="dxa" w:w="50"/>
+              <w:left w:type="dxa" w:w="70"/>
+              <w:bottom w:type="dxa" w:w="50"/>
+              <w:right w:type="dxa" w:w="70"/>
+            </w:tcMar>
+            <w:vAlign w:val="center"/>
+          </w:tcPr>
+          <w:p>
+            <w:pPr>
+              <w:jc w:val="center"/>
+            </w:pPr>
+            <w:r>
+              <w:rPr>
+                <w:rFonts w:ascii="Arial" w:cs="Arial" w:eastAsia="Arial" w:hAnsi="Arial"/>
+                <w:b w:val="false"/>
+                <w:bCs w:val="false"/>
+                <w:i w:val="false"/>
+                <w:iCs w:val="false"/>
+                <w:color w:val="222222"/>
+                <w:sz w:val="18"/>
+                <w:szCs w:val="18"/>
+              </w:rPr>
+              <w:t xml:space="preserve">0.929</w:t>
+            </w:r>
+          </w:p>
+        </w:tc>
+        <w:tc>
+          <w:tcPr>
+            <w:tcW w:type="dxa" w:w="1640"/>
+            <w:tcBorders>
+              <w:top w:val="single" w:color="B0BEC5" w:sz="4"/>
+              <w:left w:val="single" w:color="B0BEC5" w:sz="4"/>
+              <w:bottom w:val="single" w:color="B0BEC5" w:sz="4"/>
+              <w:right w:val="single" w:color="B0BEC5" w:sz="4"/>
+            </w:tcBorders>
+            <w:shd w:fill="E8EEF4" w:val="clear"/>
+            <w:tcMar>
+              <w:top w:type="dxa" w:w="50"/>
+              <w:left w:type="dxa" w:w="70"/>
+              <w:bottom w:type="dxa" w:w="50"/>
+              <w:right w:type="dxa" w:w="70"/>
+            </w:tcMar>
+            <w:vAlign w:val="center"/>
+          </w:tcPr>
+          <w:p>
+            <w:pPr>
+              <w:jc w:val="center"/>
+            </w:pPr>
+            <w:r>
+              <w:rPr>
+                <w:rFonts w:ascii="Arial" w:cs="Arial" w:eastAsia="Arial" w:hAnsi="Arial"/>
+                <w:b w:val="false"/>
+                <w:bCs w:val="false"/>
+                <w:i w:val="false"/>
+                <w:iCs w:val="false"/>
+                <w:color w:val="222222"/>
+                <w:sz w:val="18"/>
+                <w:szCs w:val="18"/>
+              </w:rPr>
+              <w:t xml:space="preserve">0</w:t>
+            </w:r>
+          </w:p>
+        </w:tc>
+      </w:tr>
+      <w:tr>
+        <w:tc>
+          <w:tcPr>
+            <w:tcW w:type="dxa" w:w="3600"/>
+            <w:tcBorders>
+              <w:top w:val="single" w:color="B0BEC5" w:sz="4"/>
+              <w:left w:val="single" w:color="B0BEC5" w:sz="4"/>
+              <w:bottom w:val="single" w:color="B0BEC5" w:sz="4"/>
+              <w:right w:val="single" w:color="B0BEC5" w:sz="4"/>
+            </w:tcBorders>
+            <w:shd w:fill="FFFFFF" w:val="clear"/>
+            <w:tcMar>
+              <w:top w:type="dxa" w:w="50"/>
+              <w:left w:type="dxa" w:w="70"/>
+              <w:bottom w:type="dxa" w:w="50"/>
+              <w:right w:type="dxa" w:w="70"/>
+            </w:tcMar>
+            <w:vAlign w:val="center"/>
+          </w:tcPr>
+          <w:p>
+            <w:pPr>
+              <w:jc w:val="left"/>
+            </w:pPr>
+            <w:r>
+              <w:rPr>
+                <w:rFonts w:ascii="Arial" w:cs="Arial" w:eastAsia="Arial" w:hAnsi="Arial"/>
+                <w:b w:val="false"/>
+                <w:bCs w:val="false"/>
+                <w:i w:val="false"/>
+                <w:iCs w:val="false"/>
+                <w:color w:val="222222"/>
+                <w:sz w:val="18"/>
+                <w:szCs w:val="18"/>
+              </w:rPr>
+              <w:t xml:space="preserve">Ensemble 0.5 / 0.5</w:t>
+            </w:r>
+          </w:p>
+        </w:tc>
+        <w:tc>
+          <w:tcPr>
+            <w:tcW w:type="dxa" w:w="1600"/>
+            <w:tcBorders>
+              <w:top w:val="single" w:color="B0BEC5" w:sz="4"/>
+              <w:left w:val="single" w:color="B0BEC5" w:sz="4"/>
+              <w:bottom w:val="single" w:color="B0BEC5" w:sz="4"/>
+              <w:right w:val="single" w:color="B0BEC5" w:sz="4"/>
+            </w:tcBorders>
+            <w:shd w:fill="FFFFFF" w:val="clear"/>
+            <w:tcMar>
+              <w:top w:type="dxa" w:w="50"/>
+              <w:left w:type="dxa" w:w="70"/>
+              <w:bottom w:type="dxa" w:w="50"/>
+              <w:right w:type="dxa" w:w="70"/>
+            </w:tcMar>
+            <w:vAlign w:val="center"/>
+          </w:tcPr>
+          <w:p>
+            <w:pPr>
+              <w:jc w:val="center"/>
+            </w:pPr>
+            <w:r>
+              <w:rPr>
+                <w:rFonts w:ascii="Arial" w:cs="Arial" w:eastAsia="Arial" w:hAnsi="Arial"/>
+                <w:b w:val="false"/>
+                <w:bCs w:val="false"/>
+                <w:i w:val="false"/>
+                <w:iCs w:val="false"/>
+                <w:color w:val="222222"/>
+                <w:sz w:val="18"/>
+                <w:szCs w:val="18"/>
+              </w:rPr>
+              <w:t xml:space="preserve">0.872</w:t>
+            </w:r>
+          </w:p>
+        </w:tc>
+        <w:tc>
+          <w:tcPr>
+            <w:tcW w:type="dxa" w:w="1600"/>
+            <w:tcBorders>
+              <w:top w:val="single" w:color="B0BEC5" w:sz="4"/>
+              <w:left w:val="single" w:color="B0BEC5" w:sz="4"/>
+              <w:bottom w:val="single" w:color="B0BEC5" w:sz="4"/>
+              <w:right w:val="single" w:color="B0BEC5" w:sz="4"/>
+            </w:tcBorders>
+            <w:shd w:fill="FFFFFF" w:val="clear"/>
+            <w:tcMar>
+              <w:top w:type="dxa" w:w="50"/>
+              <w:left w:type="dxa" w:w="70"/>
+              <w:bottom w:type="dxa" w:w="50"/>
+              <w:right w:type="dxa" w:w="70"/>
+            </w:tcMar>
+            <w:vAlign w:val="center"/>
+          </w:tcPr>
+          <w:p>
+            <w:pPr>
+              <w:jc w:val="center"/>
+            </w:pPr>
+            <w:r>
+              <w:rPr>
+                <w:rFonts w:ascii="Arial" w:cs="Arial" w:eastAsia="Arial" w:hAnsi="Arial"/>
+                <w:b w:val="false"/>
+                <w:bCs w:val="false"/>
+                <w:i w:val="false"/>
+                <w:iCs w:val="false"/>
+                <w:color w:val="222222"/>
+                <w:sz w:val="18"/>
+                <w:szCs w:val="18"/>
+              </w:rPr>
+              <w:t xml:space="preserve">0.931</w:t>
+            </w:r>
+          </w:p>
+        </w:tc>
+        <w:tc>
+          <w:tcPr>
+            <w:tcW w:type="dxa" w:w="1640"/>
+            <w:tcBorders>
+              <w:top w:val="single" w:color="B0BEC5" w:sz="4"/>
+              <w:left w:val="single" w:color="B0BEC5" w:sz="4"/>
+              <w:bottom w:val="single" w:color="B0BEC5" w:sz="4"/>
+              <w:right w:val="single" w:color="B0BEC5" w:sz="4"/>
+            </w:tcBorders>
+            <w:shd w:fill="FFFFFF" w:val="clear"/>
+            <w:tcMar>
+              <w:top w:type="dxa" w:w="50"/>
+              <w:left w:type="dxa" w:w="70"/>
+              <w:bottom w:type="dxa" w:w="50"/>
+              <w:right w:type="dxa" w:w="70"/>
+            </w:tcMar>
+            <w:vAlign w:val="center"/>
+          </w:tcPr>
+          <w:p>
+            <w:pPr>
+              <w:jc w:val="center"/>
+            </w:pPr>
+            <w:r>
+              <w:rPr>
+                <w:rFonts w:ascii="Arial" w:cs="Arial" w:eastAsia="Arial" w:hAnsi="Arial"/>
+                <w:b w:val="false"/>
+                <w:bCs w:val="false"/>
+                <w:i w:val="false"/>
+                <w:iCs w:val="false"/>
+                <w:color w:val="222222"/>
+                <w:sz w:val="18"/>
+                <w:szCs w:val="18"/>
+              </w:rPr>
+              <w:t xml:space="preserve">0.941</w:t>
+            </w:r>
+          </w:p>
+        </w:tc>
+        <w:tc>
+          <w:tcPr>
+            <w:tcW w:type="dxa" w:w="1640"/>
+            <w:tcBorders>
+              <w:top w:val="single" w:color="B0BEC5" w:sz="4"/>
+              <w:left w:val="single" w:color="B0BEC5" w:sz="4"/>
+              <w:bottom w:val="single" w:color="B0BEC5" w:sz="4"/>
+              <w:right w:val="single" w:color="B0BEC5" w:sz="4"/>
+            </w:tcBorders>
+            <w:shd w:fill="FFFFFF" w:val="clear"/>
+            <w:tcMar>
+              <w:top w:type="dxa" w:w="50"/>
+              <w:left w:type="dxa" w:w="70"/>
+              <w:bottom w:type="dxa" w:w="50"/>
+              <w:right w:type="dxa" w:w="70"/>
+            </w:tcMar>
+            <w:vAlign w:val="center"/>
+          </w:tcPr>
+          <w:p>
+            <w:pPr>
+              <w:jc w:val="center"/>
+            </w:pPr>
+            <w:r>
+              <w:rPr>
+                <w:rFonts w:ascii="Arial" w:cs="Arial" w:eastAsia="Arial" w:hAnsi="Arial"/>
+                <w:b w:val="false"/>
+                <w:bCs w:val="false"/>
+                <w:i w:val="false"/>
+                <w:iCs w:val="false"/>
+                <w:color w:val="222222"/>
+                <w:sz w:val="18"/>
+                <w:szCs w:val="18"/>
+              </w:rPr>
+              <w:t xml:space="preserve">0</w:t>
+            </w:r>
+          </w:p>
+        </w:tc>
+      </w:tr>
+      <w:tr>
+        <w:tc>
+          <w:tcPr>
+            <w:tcW w:type="dxa" w:w="3600"/>
+            <w:tcBorders>
+              <w:top w:val="single" w:color="B0BEC5" w:sz="4"/>
+              <w:left w:val="single" w:color="B0BEC5" w:sz="4"/>
+              <w:bottom w:val="single" w:color="B0BEC5" w:sz="4"/>
+              <w:right w:val="single" w:color="B0BEC5" w:sz="4"/>
+            </w:tcBorders>
+            <w:shd w:fill="E8EEF4" w:val="clear"/>
+            <w:tcMar>
+              <w:top w:type="dxa" w:w="50"/>
+              <w:left w:type="dxa" w:w="70"/>
+              <w:bottom w:type="dxa" w:w="50"/>
+              <w:right w:type="dxa" w:w="70"/>
+            </w:tcMar>
+            <w:vAlign w:val="center"/>
+          </w:tcPr>
+          <w:p>
+            <w:pPr>
+              <w:jc w:val="left"/>
+            </w:pPr>
+            <w:r>
+              <w:rPr>
+                <w:rFonts w:ascii="Arial" w:cs="Arial" w:eastAsia="Arial" w:hAnsi="Arial"/>
+                <w:b w:val="false"/>
+                <w:bCs w:val="false"/>
+                <w:i w:val="false"/>
+                <w:iCs w:val="false"/>
+                <w:color w:val="222222"/>
+                <w:sz w:val="18"/>
+                <w:szCs w:val="18"/>
+              </w:rPr>
+              <w:t xml:space="preserve">V8 + dustbin column</w:t>
+            </w:r>
+          </w:p>
+        </w:tc>
+        <w:tc>
+          <w:tcPr>
+            <w:tcW w:type="dxa" w:w="1600"/>
+            <w:tcBorders>
+              <w:top w:val="single" w:color="B0BEC5" w:sz="4"/>
+              <w:left w:val="single" w:color="B0BEC5" w:sz="4"/>
+              <w:bottom w:val="single" w:color="B0BEC5" w:sz="4"/>
+              <w:right w:val="single" w:color="B0BEC5" w:sz="4"/>
+            </w:tcBorders>
+            <w:shd w:fill="E8EEF4" w:val="clear"/>
+            <w:tcMar>
+              <w:top w:type="dxa" w:w="50"/>
+              <w:left w:type="dxa" w:w="70"/>
+              <w:bottom w:type="dxa" w:w="50"/>
+              <w:right w:type="dxa" w:w="70"/>
+            </w:tcMar>
+            <w:vAlign w:val="center"/>
+          </w:tcPr>
+          <w:p>
+            <w:pPr>
+              <w:jc w:val="center"/>
+            </w:pPr>
+            <w:r>
+              <w:rPr>
+                <w:rFonts w:ascii="Arial" w:cs="Arial" w:eastAsia="Arial" w:hAnsi="Arial"/>
+                <w:b w:val="false"/>
+                <w:bCs w:val="false"/>
+                <w:i w:val="false"/>
+                <w:iCs w:val="false"/>
+                <w:color w:val="222222"/>
+                <w:sz w:val="18"/>
+                <w:szCs w:val="18"/>
+              </w:rPr>
+              <w:t xml:space="preserve">no gain</w:t>
+            </w:r>
+          </w:p>
+        </w:tc>
+        <w:tc>
+          <w:tcPr>
+            <w:tcW w:type="dxa" w:w="1600"/>
+            <w:tcBorders>
+              <w:top w:val="single" w:color="B0BEC5" w:sz="4"/>
+              <w:left w:val="single" w:color="B0BEC5" w:sz="4"/>
+              <w:bottom w:val="single" w:color="B0BEC5" w:sz="4"/>
+              <w:right w:val="single" w:color="B0BEC5" w:sz="4"/>
+            </w:tcBorders>
+            <w:shd w:fill="E8EEF4" w:val="clear"/>
+            <w:tcMar>
+              <w:top w:type="dxa" w:w="50"/>
+              <w:left w:type="dxa" w:w="70"/>
+              <w:bottom w:type="dxa" w:w="50"/>
+              <w:right w:type="dxa" w:w="70"/>
+            </w:tcMar>
+            <w:vAlign w:val="center"/>
+          </w:tcPr>
+          <w:p>
+            <w:pPr>
+              <w:jc w:val="center"/>
+            </w:pPr>
+            <w:r>
+              <w:rPr>
+                <w:rFonts w:ascii="Arial" w:cs="Arial" w:eastAsia="Arial" w:hAnsi="Arial"/>
+                <w:b w:val="false"/>
+                <w:bCs w:val="false"/>
+                <w:i w:val="false"/>
+                <w:iCs w:val="false"/>
+                <w:color w:val="222222"/>
+                <w:sz w:val="18"/>
+                <w:szCs w:val="18"/>
+              </w:rPr>
+              <w:t xml:space="preserve">—</w:t>
+            </w:r>
+          </w:p>
+        </w:tc>
+        <w:tc>
+          <w:tcPr>
+            <w:tcW w:type="dxa" w:w="1640"/>
+            <w:tcBorders>
+              <w:top w:val="single" w:color="B0BEC5" w:sz="4"/>
+              <w:left w:val="single" w:color="B0BEC5" w:sz="4"/>
+              <w:bottom w:val="single" w:color="B0BEC5" w:sz="4"/>
+              <w:right w:val="single" w:color="B0BEC5" w:sz="4"/>
+            </w:tcBorders>
+            <w:shd w:fill="E8EEF4" w:val="clear"/>
+            <w:tcMar>
+              <w:top w:type="dxa" w:w="50"/>
+              <w:left w:type="dxa" w:w="70"/>
+              <w:bottom w:type="dxa" w:w="50"/>
+              <w:right w:type="dxa" w:w="70"/>
+            </w:tcMar>
+            <w:vAlign w:val="center"/>
+          </w:tcPr>
+          <w:p>
+            <w:pPr>
+              <w:jc w:val="center"/>
+            </w:pPr>
+            <w:r>
+              <w:rPr>
+                <w:rFonts w:ascii="Arial" w:cs="Arial" w:eastAsia="Arial" w:hAnsi="Arial"/>
+                <w:b w:val="false"/>
+                <w:bCs w:val="false"/>
+                <w:i w:val="false"/>
+                <w:iCs w:val="false"/>
+                <w:color w:val="222222"/>
+                <w:sz w:val="18"/>
+                <w:szCs w:val="18"/>
+              </w:rPr>
+              <w:t xml:space="preserve">—</w:t>
+            </w:r>
+          </w:p>
+        </w:tc>
+        <w:tc>
+          <w:tcPr>
+            <w:tcW w:type="dxa" w:w="1640"/>
+            <w:tcBorders>
+              <w:top w:val="single" w:color="B0BEC5" w:sz="4"/>
+              <w:left w:val="single" w:color="B0BEC5" w:sz="4"/>
+              <w:bottom w:val="single" w:color="B0BEC5" w:sz="4"/>
+              <w:right w:val="single" w:color="B0BEC5" w:sz="4"/>
+            </w:tcBorders>
+            <w:shd w:fill="E8EEF4" w:val="clear"/>
+            <w:tcMar>
+              <w:top w:type="dxa" w:w="50"/>
+              <w:left w:type="dxa" w:w="70"/>
+              <w:bottom w:type="dxa" w:w="50"/>
+              <w:right w:type="dxa" w:w="70"/>
+            </w:tcMar>
+            <w:vAlign w:val="center"/>
+          </w:tcPr>
+          <w:p>
+            <w:pPr>
+              <w:jc w:val="center"/>
+            </w:pPr>
+            <w:r>
+              <w:rPr>
+                <w:rFonts w:ascii="Arial" w:cs="Arial" w:eastAsia="Arial" w:hAnsi="Arial"/>
+                <w:b w:val="false"/>
+                <w:bCs w:val="false"/>
+                <w:i w:val="false"/>
+                <w:iCs w:val="false"/>
+                <w:color w:val="222222"/>
+                <w:sz w:val="18"/>
+                <w:szCs w:val="18"/>
+              </w:rPr>
+              <w:t xml:space="preserve">0</w:t>
+            </w:r>
+          </w:p>
+        </w:tc>
+      </w:tr>
+    </w:tbl>
+    <w:p>
+      <w:pPr>
+        <w:spacing w:after="240" w:before="60"/>
+        <w:jc w:val="center"/>
+      </w:pPr>
+      <w:r>
+        <w:rPr>
+          <w:rFonts w:ascii="Arial" w:cs="Arial" w:eastAsia="Arial" w:hAnsi="Arial"/>
+          <w:b w:val="false"/>
+          <w:bCs w:val="false"/>
+          <w:i/>
+          <w:iCs/>
+          <w:color w:val="5A6A75"/>
+          <w:sz w:val="18"/>
+          <w:szCs w:val="18"/>
+        </w:rPr>
+        <w:t xml:space="preserve">Table 10. stream_radar_001 ablations, same max_age = 10 contract as Table 8. Dustbin is implemented but uncalibrated — it did not move the scoreboard. Raising V8’s cluster threshold (not tabulated) under-merged PSR+SSR and birthed two tracks per aircraft.</w:t>
+      </w:r>
+    </w:p>
+    <w:p>
+      <w:pPr>
+        <w:pStyle w:val="Heading2"/>
+        <w:spacing w:after="140" w:before="280"/>
+      </w:pPr>
+      <w:r>
+        <w:rPr>
+          <w:rFonts w:ascii="Arial" w:cs="Arial" w:eastAsia="Arial" w:hAnsi="Arial"/>
+          <w:b/>
+          <w:bCs/>
+          <w:i w:val="false"/>
+          <w:iCs w:val="false"/>
+          <w:color w:val="1F4E79"/>
+          <w:sz w:val="26"/>
+          <w:szCs w:val="26"/>
+        </w:rPr>
+        <w:t xml:space="preserve">6.5  How to read this</w:t>
       </w:r>
     </w:p>
     <w:p>
@@ -11963,7 +12978,7 @@
           <w:sz w:val="22"/>
           <w:szCs w:val="22"/>
         </w:rPr>
-        <w:t xml:space="preserve">Pure V8 does not ship. It keeps zero ID switches — Hungarian is doing its job — and it slightly raises recall on the dense stream. Precision collapses because it starts extra tracks. Ablations showed the leak is mostly in clustering: the transformer draws edges the MLP would refuse. Giving clustering back to the MLP (split) recovered most of the precision. Raising the transformer’s cluster threshold made things worse (under-merge, then two tracks for one aircraft).</w:t>
+        <w:t xml:space="preserve">Pure V8 does not ship. It keeps zero ID switches — Hungarian is doing its job — and it slightly raises recall on the dense stream. Precision collapses because it starts extra tracks. Table 10 shows the leak is mostly in clustering: the transformer draws edges the MLP would refuse. Giving clustering back to the MLP (split) recovered most of the precision. Raising the transformer’s cluster threshold made things worse (under-merge, then two tracks for one aircraft).</w:t>
       </w:r>
     </w:p>
     <w:p>
@@ -12080,7 +13095,7 @@
           <w:sz w:val="22"/>
           <w:szCs w:val="22"/>
         </w:rPr>
-        <w:t xml:space="preserve">The dense sim stream is harder (many more IDs in two minutes, five unsynchronized radars). Ensemble’s small MOTA and recall gain there is the first quantitative hint that set context helps when pairs get crowded. It is not yet a crossing study.</w:t>
+        <w:t xml:space="preserve">The dense sim stream is harder (many more IDs in two minutes, five unsynchronized radars). Ensemble’s single-run +0.007 MOTA and small recall bump there is the first quantitative hint that set context helps when pairs get crowded. It is not yet a crossing study, and it is not a repeated-seed result.</w:t>
       </w:r>
     </w:p>
     <w:p>
@@ -12205,7 +13220,7 @@
           <w:sz w:val="22"/>
           <w:szCs w:val="22"/>
         </w:rPr>
-        <w:t xml:space="preserve">Research path: Hybrid + ensemble with the Sweden-tuned V8 checkpoint. Slight dense-sim gain, Sweden tie, zero ID switches.</w:t>
+        <w:t xml:space="preserve">Research path: Hybrid + ensemble with the Sweden-tuned V8 checkpoint. Single-run +0.007 MOTA on the dense stream, Sweden tie to three decimals, zero ID switches.</w:t>
       </w:r>
     </w:p>
     <w:p>
@@ -12422,7 +13437,7 @@
           <w:sz w:val="22"/>
           <w:szCs w:val="22"/>
         </w:rPr>
-        <w:t xml:space="preserve">V8 is how the net comes back — as a pair scorer that can see the traffic around the pair. Ensemble is the first time that idea helps the scoreboard without breaking identity. Hybrid still has the highest standalone results. The transformer is the architecture we will need when the pairs start to lie.</w:t>
+        <w:t xml:space="preserve">V8 is how the net comes back — as a pair scorer that can see the traffic around the pair. Ensemble is the first time that idea moves the dense-stream scoreboard without breaking identity, and only by a single-run +0.007 MOTA. Hybrid still has the highest standalone results. The transformer is the architecture we will need when the pairs start to lie.</w:t>
       </w:r>
     </w:p>
     <w:p>

</xml_diff>

<commit_message>
Add Hybrid + V8 architecture figure to the progress report
Two-panel diagram: pipeline with the learned scorer slot, then the
V8 token / self-attn / pair-head path. Figure 1 in the report.
</commit_message>
<xml_diff>
--- a/artifacts/Capstone_Progress_Report.docx
+++ b/artifacts/Capstone_Progress_Report.docx
@@ -753,9 +753,9 @@
       <w:r>
         <w:drawing>
           <wp:inline distT="0" distB="0" distL="0" distR="0">
-            <wp:extent cx="5905500" cy="3324225"/>
+            <wp:extent cx="6096000" cy="4371975"/>
             <wp:effectExtent t="0" r="0" b="0" l="0"/>
-            <wp:docPr id="1" name="Hybrid tracker simulation with confirmed tracks and trails" descr="Hybrid tracker simulation with confirmed tracks and trails" title="Hybrid tracker simulation with confirmed tracks and trails"/>
+            <wp:docPr id="1" name="Hybrid pipeline and V8 associator architecture" descr="Hybrid pipeline and V8 associator architecture" title="Hybrid pipeline and V8 associator architecture"/>
             <wp:cNvGraphicFramePr>
               <a:graphicFrameLocks xmlns:a="http://schemas.openxmlformats.org/drawingml/2006/main" noChangeAspect="1"/>
             </wp:cNvGraphicFramePr>
@@ -778,6 +778,71 @@
                   <pic:spPr bwMode="auto">
                     <a:xfrm>
                       <a:off x="0" y="0"/>
+                      <a:ext cx="6096000" cy="4371975"/>
+                    </a:xfrm>
+                    <a:prstGeom prst="rect">
+                      <a:avLst/>
+                    </a:prstGeom>
+                  </pic:spPr>
+                </pic:pic>
+              </a:graphicData>
+            </a:graphic>
+          </wp:inline>
+        </w:drawing>
+      </w:r>
+    </w:p>
+    <w:p>
+      <w:pPr>
+        <w:spacing w:after="240" w:before="60"/>
+        <w:jc w:val="center"/>
+      </w:pPr>
+      <w:r>
+        <w:rPr>
+          <w:rFonts w:ascii="Arial" w:cs="Arial" w:eastAsia="Arial" w:hAnsi="Arial"/>
+          <w:b w:val="false"/>
+          <w:bCs w:val="false"/>
+          <w:i/>
+          <w:iCs/>
+          <w:color w:val="5A6A75"/>
+          <w:sz w:val="18"/>
+          <w:szCs w:val="18"/>
+        </w:rPr>
+        <w:t xml:space="preserve">Figure 1. How the model works. Top: Hybrid pipeline. Purple block is the only neural scorer — MLP, V8, ensemble, or split. Kalman, gates, Hungarian, and M/N stay classical. Bottom: V8 token path. Self-attention is within tracks and within plots; geometry stays in rel_ij. The net never predicts state or existence.</w:t>
+      </w:r>
+    </w:p>
+    <w:p>
+      <w:pPr>
+        <w:spacing w:after="40" w:before="120"/>
+        <w:jc w:val="center"/>
+      </w:pPr>
+      <w:r>
+        <w:drawing>
+          <wp:inline distT="0" distB="0" distL="0" distR="0">
+            <wp:extent cx="5905500" cy="3324225"/>
+            <wp:effectExtent t="0" r="0" b="0" l="0"/>
+            <wp:docPr id="1" name="Hybrid tracker simulation with confirmed tracks and trails" descr="Hybrid tracker simulation with confirmed tracks and trails" title="Hybrid tracker simulation with confirmed tracks and trails"/>
+            <wp:cNvGraphicFramePr>
+              <a:graphicFrameLocks xmlns:a="http://schemas.openxmlformats.org/drawingml/2006/main" noChangeAspect="1"/>
+            </wp:cNvGraphicFramePr>
+            <a:graphic xmlns:a="http://schemas.openxmlformats.org/drawingml/2006/main">
+              <a:graphicData uri="http://schemas.openxmlformats.org/drawingml/2006/picture">
+                <pic:pic xmlns:pic="http://schemas.openxmlformats.org/drawingml/2006/picture">
+                  <pic:nvPicPr>
+                    <pic:cNvPr id="0" name="" descr=""/>
+                    <pic:cNvPicPr>
+                      <a:picLocks noChangeAspect="1" noChangeArrowheads="1"/>
+                    </pic:cNvPicPr>
+                  </pic:nvPicPr>
+                  <pic:blipFill>
+                    <a:blip r:embed="rId10" cstate="none"/>
+                    <a:srcRect/>
+                    <a:stretch>
+                      <a:fillRect/>
+                    </a:stretch>
+                  </pic:blipFill>
+                  <pic:spPr bwMode="auto">
+                    <a:xfrm>
+                      <a:off x="0" y="0"/>
                       <a:ext cx="5905500" cy="3324225"/>
                     </a:xfrm>
                     <a:prstGeom prst="rect">
@@ -807,7 +872,7 @@
           <w:sz w:val="18"/>
           <w:szCs w:val="18"/>
         </w:rPr>
-        <w:t xml:space="preserve">Figure 1. Hybrid correlator on a streaming holdout: clutter, measurements, ground truth, and confirmed tracks with trails.</w:t>
+        <w:t xml:space="preserve">Figure 2. Hybrid correlator on a streaming holdout: clutter, measurements, ground truth, and confirmed tracks with trails.</w:t>
       </w:r>
     </w:p>
     <w:p>
@@ -11906,7 +11971,7 @@
                     </pic:cNvPicPr>
                   </pic:nvPicPr>
                   <pic:blipFill>
-                    <a:blip r:embed="rId10" cstate="none"/>
+                    <a:blip r:embed="rId11" cstate="none"/>
                     <a:srcRect/>
                     <a:stretch>
                       <a:fillRect/>
@@ -11944,7 +12009,7 @@
           <w:sz w:val="18"/>
           <w:szCs w:val="18"/>
         </w:rPr>
-        <w:t xml:space="preserve">Figure 2. Sweden 30-minute holdout traffic used for the Hybrid / V8 / ensemble comparison.</w:t>
+        <w:t xml:space="preserve">Figure 3. Sweden 30-minute holdout traffic used for the Hybrid / V8 / ensemble comparison.</w:t>
       </w:r>
     </w:p>
     <w:p>

</xml_diff>